<commit_message>
PD šablóny: batéria a parcely podmienene (jinja if ma_bateriu/parcely) — bez batérie/parciel sa časti vety a riadok Parcely vynechajú
</commit_message>
<xml_diff>
--- a/templates_projekcia/technicka_sprava_b2b.docx
+++ b/templates_projekcia/technicka_sprava_b2b.docx
@@ -6712,14 +6712,13 @@
           <w:rFonts w:ascii="Arial" w:hAnsi="Arial" w:cs="Arial"/>
           <w:szCs w:val="18"/>
         </w:rPr>
-        <w:t xml:space="preserve">Parcely </w:t>
+        <w:t>{% if parcely %}Parcely {{parcely}}{% endif %}</w:t>
       </w:r>
       <w:r>
         <w:rPr>
           <w:rFonts w:ascii="Arial" w:hAnsi="Arial" w:cs="Arial"/>
           <w:szCs w:val="18"/>
         </w:rPr>
-        <w:t>{{parcely}}</w:t>
       </w:r>
     </w:p>
     <w:p>
@@ -7007,121 +7006,103 @@
         <w:rPr>
           <w:rFonts w:ascii="Arial" w:hAnsi="Arial" w:cs="Arial"/>
         </w:rPr>
-        <w:t xml:space="preserve">Projekt </w:t>
-      </w:r>
-      <w:r>
-        <w:rPr>
-          <w:rFonts w:ascii="Arial" w:hAnsi="Arial" w:cs="Arial"/>
-        </w:rPr>
-        <w:t>rieši</w:t>
-      </w:r>
-      <w:r>
-        <w:rPr>
-          <w:rFonts w:ascii="Arial" w:hAnsi="Arial" w:cs="Arial"/>
-        </w:rPr>
-        <w:t xml:space="preserve"> </w:t>
-      </w:r>
-      <w:r>
-        <w:rPr>
-          <w:rFonts w:ascii="Arial" w:hAnsi="Arial" w:cs="Arial"/>
-        </w:rPr>
-        <w:t xml:space="preserve">inštaláciu </w:t>
+        <w:t>Projekt rieši inštaláciu fotovoltického zariadenia (ďalej len FVZ) o výkone {{vykon_ac}}kW{% if ma_bateriu %} a batériového úložiska {{bateria}}{% endif %}{% if parcely %} na parcelách {{parcely}}{% endif %} za účelom zníženia energetickej náročnosti objektu.</w:t>
+      </w:r>
+      <w:r>
+        <w:rPr>
+          <w:rFonts w:ascii="Arial" w:hAnsi="Arial" w:cs="Arial"/>
+        </w:rPr>
+      </w:r>
+      <w:r>
+        <w:rPr>
+          <w:rFonts w:ascii="Arial" w:hAnsi="Arial" w:cs="Arial"/>
+        </w:rPr>
+      </w:r>
+      <w:r>
+        <w:rPr>
+          <w:rFonts w:ascii="Arial" w:hAnsi="Arial" w:cs="Arial"/>
+        </w:rPr>
       </w:r>
       <w:proofErr w:type="spellStart"/>
       <w:r>
         <w:rPr>
           <w:rFonts w:ascii="Arial" w:hAnsi="Arial" w:cs="Arial"/>
         </w:rPr>
-        <w:t>fotovoltick</w:t>
-      </w:r>
-      <w:r>
-        <w:rPr>
-          <w:rFonts w:ascii="Arial" w:hAnsi="Arial" w:cs="Arial"/>
-        </w:rPr>
-        <w:t>ého</w:t>
+      </w:r>
+      <w:r>
+        <w:rPr>
+          <w:rFonts w:ascii="Arial" w:hAnsi="Arial" w:cs="Arial"/>
+        </w:rPr>
       </w:r>
       <w:proofErr w:type="spellEnd"/>
       <w:r>
         <w:rPr>
           <w:rFonts w:ascii="Arial" w:hAnsi="Arial" w:cs="Arial"/>
         </w:rPr>
-        <w:t xml:space="preserve"> zariaden</w:t>
-      </w:r>
-      <w:r>
-        <w:rPr>
-          <w:rFonts w:ascii="Arial" w:hAnsi="Arial" w:cs="Arial"/>
-        </w:rPr>
-        <w:t>ia</w:t>
-      </w:r>
-      <w:r>
-        <w:rPr>
-          <w:rFonts w:ascii="Arial" w:hAnsi="Arial" w:cs="Arial"/>
-        </w:rPr>
-        <w:t xml:space="preserve"> </w:t>
-      </w:r>
-      <w:r>
-        <w:rPr>
-          <w:rFonts w:ascii="Arial" w:hAnsi="Arial" w:cs="Arial"/>
-        </w:rPr>
-        <w:t xml:space="preserve">(ďalej len FVZ) </w:t>
-      </w:r>
-      <w:r>
-        <w:rPr>
-          <w:rFonts w:ascii="Arial" w:hAnsi="Arial" w:cs="Arial"/>
-        </w:rPr>
-        <w:t xml:space="preserve">o výkone </w:t>
-      </w:r>
-      <w:r>
-        <w:rPr>
-          <w:rFonts w:ascii="Arial" w:hAnsi="Arial" w:cs="Arial"/>
-        </w:rPr>
-        <w:t>{{</w:t>
+      </w:r>
+      <w:r>
+        <w:rPr>
+          <w:rFonts w:ascii="Arial" w:hAnsi="Arial" w:cs="Arial"/>
+        </w:rPr>
+      </w:r>
+      <w:r>
+        <w:rPr>
+          <w:rFonts w:ascii="Arial" w:hAnsi="Arial" w:cs="Arial"/>
+        </w:rPr>
+      </w:r>
+      <w:r>
+        <w:rPr>
+          <w:rFonts w:ascii="Arial" w:hAnsi="Arial" w:cs="Arial"/>
+        </w:rPr>
+      </w:r>
+      <w:r>
+        <w:rPr>
+          <w:rFonts w:ascii="Arial" w:hAnsi="Arial" w:cs="Arial"/>
+        </w:rPr>
+      </w:r>
+      <w:r>
+        <w:rPr>
+          <w:rFonts w:ascii="Arial" w:hAnsi="Arial" w:cs="Arial"/>
+        </w:rPr>
       </w:r>
       <w:proofErr w:type="spellStart"/>
       <w:r>
         <w:rPr>
           <w:rFonts w:ascii="Arial" w:hAnsi="Arial" w:cs="Arial"/>
         </w:rPr>
-        <w:t>vykon_ac</w:t>
       </w:r>
       <w:proofErr w:type="spellEnd"/>
       <w:r>
         <w:rPr>
           <w:rFonts w:ascii="Arial" w:hAnsi="Arial" w:cs="Arial"/>
         </w:rPr>
-        <w:t>}}</w:t>
-      </w:r>
-      <w:r>
-        <w:rPr>
-          <w:rFonts w:ascii="Arial" w:hAnsi="Arial" w:cs="Arial"/>
-        </w:rPr>
-        <w:t>kW</w:t>
-      </w:r>
-      <w:r>
-        <w:rPr>
-          <w:rFonts w:ascii="Arial" w:hAnsi="Arial" w:cs="Arial"/>
-        </w:rPr>
-        <w:t xml:space="preserve"> </w:t>
-      </w:r>
-      <w:r>
-        <w:rPr>
-          <w:rFonts w:ascii="Arial" w:hAnsi="Arial" w:cs="Arial"/>
-        </w:rPr>
-        <w:t xml:space="preserve">a </w:t>
+      </w:r>
+      <w:r>
+        <w:rPr>
+          <w:rFonts w:ascii="Arial" w:hAnsi="Arial" w:cs="Arial"/>
+        </w:rPr>
+      </w:r>
+      <w:r>
+        <w:rPr>
+          <w:rFonts w:ascii="Arial" w:hAnsi="Arial" w:cs="Arial"/>
+        </w:rPr>
+      </w:r>
+      <w:r>
+        <w:rPr>
+          <w:rFonts w:ascii="Arial" w:hAnsi="Arial" w:cs="Arial"/>
+        </w:rPr>
       </w:r>
       <w:r>
         <w:rPr>
           <w:rFonts w:ascii="Arial" w:hAnsi="Arial" w:cs="Arial"/>
           <w:highlight w:val="yellow"/>
         </w:rPr>
-        <w:t xml:space="preserve">batériového úložiska </w:t>
       </w:r>
       <w:r>
         <w:rPr>
           <w:rFonts w:ascii="Arial" w:hAnsi="Arial" w:cs="Arial"/>
           <w:highlight w:val="yellow"/>
         </w:rPr>
-        <w:t>{{</w:t>
       </w:r>
       <w:proofErr w:type="spellStart"/>
       <w:r>
@@ -7129,7 +7110,6 @@
           <w:rFonts w:ascii="Arial" w:hAnsi="Arial" w:cs="Arial"/>
           <w:highlight w:val="yellow"/>
         </w:rPr>
-        <w:t>bateria</w:t>
       </w:r>
       <w:proofErr w:type="spellEnd"/>
       <w:r>
@@ -7137,61 +7117,51 @@
           <w:rFonts w:ascii="Arial" w:hAnsi="Arial" w:cs="Arial"/>
           <w:highlight w:val="yellow"/>
         </w:rPr>
-        <w:t>}}</w:t>
-      </w:r>
-      <w:r>
-        <w:rPr>
-          <w:rFonts w:ascii="Arial" w:hAnsi="Arial" w:cs="Arial"/>
-        </w:rPr>
-        <w:t xml:space="preserve"> </w:t>
-      </w:r>
-      <w:r>
-        <w:rPr>
-          <w:rFonts w:ascii="Arial" w:hAnsi="Arial" w:cs="Arial"/>
-        </w:rPr>
-        <w:t>na parcel</w:t>
-      </w:r>
-      <w:r>
-        <w:rPr>
-          <w:rFonts w:ascii="Arial" w:hAnsi="Arial" w:cs="Arial"/>
-        </w:rPr>
-        <w:t>ách</w:t>
-      </w:r>
-      <w:r>
-        <w:rPr>
-          <w:rFonts w:ascii="Arial" w:hAnsi="Arial" w:cs="Arial"/>
-        </w:rPr>
-        <w:t xml:space="preserve"> </w:t>
-      </w:r>
-      <w:r>
-        <w:rPr>
-          <w:rFonts w:ascii="Arial" w:hAnsi="Arial" w:cs="Arial"/>
-        </w:rPr>
-        <w:t>{{parcely}}</w:t>
-      </w:r>
-      <w:r>
-        <w:rPr>
-          <w:rFonts w:ascii="Arial" w:hAnsi="Arial" w:cs="Arial"/>
-        </w:rPr>
-        <w:t xml:space="preserve"> </w:t>
-      </w:r>
-      <w:r>
-        <w:rPr>
-          <w:rFonts w:ascii="Arial" w:hAnsi="Arial" w:cs="Arial"/>
-        </w:rPr>
-        <w:t>za účelom zníženia energetickej náročnosti</w:t>
-      </w:r>
-      <w:r>
-        <w:rPr>
-          <w:rFonts w:ascii="Arial" w:hAnsi="Arial" w:cs="Arial"/>
-        </w:rPr>
-        <w:t xml:space="preserve"> objektu</w:t>
-      </w:r>
-      <w:r>
-        <w:rPr>
-          <w:rFonts w:ascii="Arial" w:hAnsi="Arial" w:cs="Arial"/>
-        </w:rPr>
-        <w:t>.</w:t>
+      </w:r>
+      <w:r>
+        <w:rPr>
+          <w:rFonts w:ascii="Arial" w:hAnsi="Arial" w:cs="Arial"/>
+        </w:rPr>
+      </w:r>
+      <w:r>
+        <w:rPr>
+          <w:rFonts w:ascii="Arial" w:hAnsi="Arial" w:cs="Arial"/>
+        </w:rPr>
+      </w:r>
+      <w:r>
+        <w:rPr>
+          <w:rFonts w:ascii="Arial" w:hAnsi="Arial" w:cs="Arial"/>
+        </w:rPr>
+      </w:r>
+      <w:r>
+        <w:rPr>
+          <w:rFonts w:ascii="Arial" w:hAnsi="Arial" w:cs="Arial"/>
+        </w:rPr>
+      </w:r>
+      <w:r>
+        <w:rPr>
+          <w:rFonts w:ascii="Arial" w:hAnsi="Arial" w:cs="Arial"/>
+        </w:rPr>
+      </w:r>
+      <w:r>
+        <w:rPr>
+          <w:rFonts w:ascii="Arial" w:hAnsi="Arial" w:cs="Arial"/>
+        </w:rPr>
+      </w:r>
+      <w:r>
+        <w:rPr>
+          <w:rFonts w:ascii="Arial" w:hAnsi="Arial" w:cs="Arial"/>
+        </w:rPr>
+      </w:r>
+      <w:r>
+        <w:rPr>
+          <w:rFonts w:ascii="Arial" w:hAnsi="Arial" w:cs="Arial"/>
+        </w:rPr>
+      </w:r>
+      <w:r>
+        <w:rPr>
+          <w:rFonts w:ascii="Arial" w:hAnsi="Arial" w:cs="Arial"/>
+        </w:rPr>
       </w:r>
     </w:p>
     <w:p>

</xml_diff>